<commit_message>
docs: add 10 key module programs to SRS docx and update download copy
</commit_message>
<xml_diff>
--- a/docs/Sports_Anti_Doping_Monitoring_System_SRS.docx
+++ b/docs/Sports_Anti_Doping_Monitoring_System_SRS.docx
@@ -67,7 +67,7 @@
           <w:color w:val="000000"/>
           <w:sz w:val="24"/>
         </w:rPr>
-        <w:t>Version: 1.1.0</w:t>
+        <w:t>Version: 1.2.0</w:t>
         <w:br/>
         <w:t>Prepared by: System Architecture &amp; Engineering Team</w:t>
         <w:br/>
@@ -1703,6 +1703,391 @@
           <w:sz w:val="22"/>
         </w:rPr>
         <w:t>48</w:t>
+      </w:r>
+    </w:p>
+    <w:p>
+      <w:pPr>
+        <w:spacing w:after="40" w:line="276" w:lineRule="auto"/>
+      </w:pPr>
+      <w:r>
+        <w:rPr>
+          <w:rFonts w:ascii="Times New Roman" w:hAnsi="Times New Roman"/>
+          <w:b w:val="0"/>
+          <w:i w:val="0"/>
+          <w:color w:val="000000"/>
+          <w:sz w:val="22"/>
+        </w:rPr>
+        <w:t>8. Key Module Source Code Implementation</w:t>
+      </w:r>
+      <w:r>
+        <w:rPr>
+          <w:rFonts w:ascii="Times New Roman" w:hAnsi="Times New Roman"/>
+          <w:b w:val="0"/>
+          <w:i w:val="0"/>
+          <w:color w:val="787878"/>
+          <w:sz w:val="20"/>
+        </w:rPr>
+        <w:t xml:space="preserve"> ................................... </w:t>
+      </w:r>
+      <w:r>
+        <w:rPr>
+          <w:rFonts w:ascii="Times New Roman" w:hAnsi="Times New Roman"/>
+          <w:b/>
+          <w:i w:val="0"/>
+          <w:color w:val="000000"/>
+          <w:sz w:val="22"/>
+        </w:rPr>
+        <w:t>49</w:t>
+      </w:r>
+    </w:p>
+    <w:p>
+      <w:pPr>
+        <w:spacing w:after="40" w:line="276" w:lineRule="auto"/>
+      </w:pPr>
+      <w:r>
+        <w:rPr>
+          <w:rFonts w:ascii="Times New Roman" w:hAnsi="Times New Roman"/>
+          <w:b w:val="0"/>
+          <w:i w:val="0"/>
+          <w:color w:val="000000"/>
+          <w:sz w:val="22"/>
+        </w:rPr>
+        <w:t xml:space="preserve">    8.1 Module 1: Custom User Authentication &amp; Role Model</w:t>
+      </w:r>
+      <w:r>
+        <w:rPr>
+          <w:rFonts w:ascii="Times New Roman" w:hAnsi="Times New Roman"/>
+          <w:b w:val="0"/>
+          <w:i w:val="0"/>
+          <w:color w:val="787878"/>
+          <w:sz w:val="20"/>
+        </w:rPr>
+        <w:t xml:space="preserve"> .................. </w:t>
+      </w:r>
+      <w:r>
+        <w:rPr>
+          <w:rFonts w:ascii="Times New Roman" w:hAnsi="Times New Roman"/>
+          <w:b/>
+          <w:i w:val="0"/>
+          <w:color w:val="000000"/>
+          <w:sz w:val="22"/>
+        </w:rPr>
+        <w:t>49</w:t>
+      </w:r>
+    </w:p>
+    <w:p>
+      <w:pPr>
+        <w:spacing w:after="40" w:line="276" w:lineRule="auto"/>
+      </w:pPr>
+      <w:r>
+        <w:rPr>
+          <w:rFonts w:ascii="Times New Roman" w:hAnsi="Times New Roman"/>
+          <w:b w:val="0"/>
+          <w:i w:val="0"/>
+          <w:color w:val="000000"/>
+          <w:sz w:val="22"/>
+        </w:rPr>
+        <w:t xml:space="preserve">    8.2 Module 2: Registration &amp; Administrator Verification Controller</w:t>
+      </w:r>
+      <w:r>
+        <w:rPr>
+          <w:rFonts w:ascii="Times New Roman" w:hAnsi="Times New Roman"/>
+          <w:b w:val="0"/>
+          <w:i w:val="0"/>
+          <w:color w:val="787878"/>
+          <w:sz w:val="20"/>
+        </w:rPr>
+        <w:t xml:space="preserve"> ..... </w:t>
+      </w:r>
+      <w:r>
+        <w:rPr>
+          <w:rFonts w:ascii="Times New Roman" w:hAnsi="Times New Roman"/>
+          <w:b/>
+          <w:i w:val="0"/>
+          <w:color w:val="000000"/>
+          <w:sz w:val="22"/>
+        </w:rPr>
+        <w:t>51</w:t>
+      </w:r>
+    </w:p>
+    <w:p>
+      <w:pPr>
+        <w:spacing w:after="40" w:line="276" w:lineRule="auto"/>
+      </w:pPr>
+      <w:r>
+        <w:rPr>
+          <w:rFonts w:ascii="Times New Roman" w:hAnsi="Times New Roman"/>
+          <w:b w:val="0"/>
+          <w:i w:val="0"/>
+          <w:color w:val="000000"/>
+          <w:sz w:val="22"/>
+        </w:rPr>
+        <w:t xml:space="preserve">    8.3 Module 3: Role-Based Access Control (RBAC) Permissions Engine</w:t>
+      </w:r>
+      <w:r>
+        <w:rPr>
+          <w:rFonts w:ascii="Times New Roman" w:hAnsi="Times New Roman"/>
+          <w:b w:val="0"/>
+          <w:i w:val="0"/>
+          <w:color w:val="787878"/>
+          <w:sz w:val="20"/>
+        </w:rPr>
+        <w:t xml:space="preserve"> ...... </w:t>
+      </w:r>
+      <w:r>
+        <w:rPr>
+          <w:rFonts w:ascii="Times New Roman" w:hAnsi="Times New Roman"/>
+          <w:b/>
+          <w:i w:val="0"/>
+          <w:color w:val="000000"/>
+          <w:sz w:val="22"/>
+        </w:rPr>
+        <w:t>53</w:t>
+      </w:r>
+    </w:p>
+    <w:p>
+      <w:pPr>
+        <w:spacing w:after="40" w:line="276" w:lineRule="auto"/>
+      </w:pPr>
+      <w:r>
+        <w:rPr>
+          <w:rFonts w:ascii="Times New Roman" w:hAnsi="Times New Roman"/>
+          <w:b w:val="0"/>
+          <w:i w:val="0"/>
+          <w:color w:val="000000"/>
+          <w:sz w:val="22"/>
+        </w:rPr>
+        <w:t xml:space="preserve">    8.4 Module 4: Doping Test Mission Model &amp; State Machine</w:t>
+      </w:r>
+      <w:r>
+        <w:rPr>
+          <w:rFonts w:ascii="Times New Roman" w:hAnsi="Times New Roman"/>
+          <w:b w:val="0"/>
+          <w:i w:val="0"/>
+          <w:color w:val="787878"/>
+          <w:sz w:val="20"/>
+        </w:rPr>
+        <w:t xml:space="preserve"> ................ </w:t>
+      </w:r>
+      <w:r>
+        <w:rPr>
+          <w:rFonts w:ascii="Times New Roman" w:hAnsi="Times New Roman"/>
+          <w:b/>
+          <w:i w:val="0"/>
+          <w:color w:val="000000"/>
+          <w:sz w:val="22"/>
+        </w:rPr>
+        <w:t>55</w:t>
+      </w:r>
+    </w:p>
+    <w:p>
+      <w:pPr>
+        <w:spacing w:after="40" w:line="276" w:lineRule="auto"/>
+      </w:pPr>
+      <w:r>
+        <w:rPr>
+          <w:rFonts w:ascii="Times New Roman" w:hAnsi="Times New Roman"/>
+          <w:b w:val="0"/>
+          <w:i w:val="0"/>
+          <w:color w:val="000000"/>
+          <w:sz w:val="22"/>
+        </w:rPr>
+        <w:t xml:space="preserve">    8.5 Module 5: Tamper-Evident Biological Sample Collection Model</w:t>
+      </w:r>
+      <w:r>
+        <w:rPr>
+          <w:rFonts w:ascii="Times New Roman" w:hAnsi="Times New Roman"/>
+          <w:b w:val="0"/>
+          <w:i w:val="0"/>
+          <w:color w:val="787878"/>
+          <w:sz w:val="20"/>
+        </w:rPr>
+        <w:t xml:space="preserve"> ........ </w:t>
+      </w:r>
+      <w:r>
+        <w:rPr>
+          <w:rFonts w:ascii="Times New Roman" w:hAnsi="Times New Roman"/>
+          <w:b/>
+          <w:i w:val="0"/>
+          <w:color w:val="000000"/>
+          <w:sz w:val="22"/>
+        </w:rPr>
+        <w:t>57</w:t>
+      </w:r>
+    </w:p>
+    <w:p>
+      <w:pPr>
+        <w:spacing w:after="40" w:line="276" w:lineRule="auto"/>
+      </w:pPr>
+      <w:r>
+        <w:rPr>
+          <w:rFonts w:ascii="Times New Roman" w:hAnsi="Times New Roman"/>
+          <w:b w:val="0"/>
+          <w:i w:val="0"/>
+          <w:color w:val="000000"/>
+          <w:sz w:val="22"/>
+        </w:rPr>
+        <w:t xml:space="preserve">    8.6 Module 6: Laboratory Assay Intake &amp; Atomic ADRV Escalation</w:t>
+      </w:r>
+      <w:r>
+        <w:rPr>
+          <w:rFonts w:ascii="Times New Roman" w:hAnsi="Times New Roman"/>
+          <w:b w:val="0"/>
+          <w:i w:val="0"/>
+          <w:color w:val="787878"/>
+          <w:sz w:val="20"/>
+        </w:rPr>
+        <w:t xml:space="preserve"> ......... </w:t>
+      </w:r>
+      <w:r>
+        <w:rPr>
+          <w:rFonts w:ascii="Times New Roman" w:hAnsi="Times New Roman"/>
+          <w:b/>
+          <w:i w:val="0"/>
+          <w:color w:val="000000"/>
+          <w:sz w:val="22"/>
+        </w:rPr>
+        <w:t>59</w:t>
+      </w:r>
+    </w:p>
+    <w:p>
+      <w:pPr>
+        <w:spacing w:after="40" w:line="276" w:lineRule="auto"/>
+      </w:pPr>
+      <w:r>
+        <w:rPr>
+          <w:rFonts w:ascii="Times New Roman" w:hAnsi="Times New Roman"/>
+          <w:b w:val="0"/>
+          <w:i w:val="0"/>
+          <w:color w:val="000000"/>
+          <w:sz w:val="22"/>
+        </w:rPr>
+        <w:t xml:space="preserve">    8.7 Module 7: Anti-Doping Rule Violation &amp; Disciplinary Model</w:t>
+      </w:r>
+      <w:r>
+        <w:rPr>
+          <w:rFonts w:ascii="Times New Roman" w:hAnsi="Times New Roman"/>
+          <w:b w:val="0"/>
+          <w:i w:val="0"/>
+          <w:color w:val="787878"/>
+          <w:sz w:val="20"/>
+        </w:rPr>
+        <w:t xml:space="preserve"> .......... </w:t>
+      </w:r>
+      <w:r>
+        <w:rPr>
+          <w:rFonts w:ascii="Times New Roman" w:hAnsi="Times New Roman"/>
+          <w:b/>
+          <w:i w:val="0"/>
+          <w:color w:val="000000"/>
+          <w:sz w:val="22"/>
+        </w:rPr>
+        <w:t>61</w:t>
+      </w:r>
+    </w:p>
+    <w:p>
+      <w:pPr>
+        <w:spacing w:after="40" w:line="276" w:lineRule="auto"/>
+      </w:pPr>
+      <w:r>
+        <w:rPr>
+          <w:rFonts w:ascii="Times New Roman" w:hAnsi="Times New Roman"/>
+          <w:b w:val="0"/>
+          <w:i w:val="0"/>
+          <w:color w:val="000000"/>
+          <w:sz w:val="22"/>
+        </w:rPr>
+        <w:t xml:space="preserve">    8.8 Module 8: Automated Notification Dispatcher Utility</w:t>
+      </w:r>
+      <w:r>
+        <w:rPr>
+          <w:rFonts w:ascii="Times New Roman" w:hAnsi="Times New Roman"/>
+          <w:b w:val="0"/>
+          <w:i w:val="0"/>
+          <w:color w:val="787878"/>
+          <w:sz w:val="20"/>
+        </w:rPr>
+        <w:t xml:space="preserve"> ................ </w:t>
+      </w:r>
+      <w:r>
+        <w:rPr>
+          <w:rFonts w:ascii="Times New Roman" w:hAnsi="Times New Roman"/>
+          <w:b/>
+          <w:i w:val="0"/>
+          <w:color w:val="000000"/>
+          <w:sz w:val="22"/>
+        </w:rPr>
+        <w:t>63</w:t>
+      </w:r>
+    </w:p>
+    <w:p>
+      <w:pPr>
+        <w:spacing w:after="40" w:line="276" w:lineRule="auto"/>
+      </w:pPr>
+      <w:r>
+        <w:rPr>
+          <w:rFonts w:ascii="Times New Roman" w:hAnsi="Times New Roman"/>
+          <w:b w:val="0"/>
+          <w:i w:val="0"/>
+          <w:color w:val="000000"/>
+          <w:sz w:val="22"/>
+        </w:rPr>
+        <w:t xml:space="preserve">    8.9 Module 9: Client-Side JWT Auth &amp; Verification Guard Client</w:t>
+      </w:r>
+      <w:r>
+        <w:rPr>
+          <w:rFonts w:ascii="Times New Roman" w:hAnsi="Times New Roman"/>
+          <w:b w:val="0"/>
+          <w:i w:val="0"/>
+          <w:color w:val="787878"/>
+          <w:sz w:val="20"/>
+        </w:rPr>
+        <w:t xml:space="preserve"> ......... </w:t>
+      </w:r>
+      <w:r>
+        <w:rPr>
+          <w:rFonts w:ascii="Times New Roman" w:hAnsi="Times New Roman"/>
+          <w:b/>
+          <w:i w:val="0"/>
+          <w:color w:val="000000"/>
+          <w:sz w:val="22"/>
+        </w:rPr>
+        <w:t>64</w:t>
+      </w:r>
+    </w:p>
+    <w:p>
+      <w:pPr>
+        <w:spacing w:after="40" w:line="276" w:lineRule="auto"/>
+      </w:pPr>
+      <w:r>
+        <w:rPr>
+          <w:rFonts w:ascii="Times New Roman" w:hAnsi="Times New Roman"/>
+          <w:b w:val="0"/>
+          <w:i w:val="0"/>
+          <w:color w:val="000000"/>
+          <w:sz w:val="22"/>
+        </w:rPr>
+        <w:t xml:space="preserve">    8.10 Module 10: Multi-Role Registration &amp; Accreditation UI Component</w:t>
+      </w:r>
+      <w:r>
+        <w:rPr>
+          <w:rFonts w:ascii="Times New Roman" w:hAnsi="Times New Roman"/>
+          <w:b w:val="0"/>
+          <w:i w:val="0"/>
+          <w:color w:val="787878"/>
+          <w:sz w:val="20"/>
+        </w:rPr>
+        <w:t xml:space="preserve"> ..... </w:t>
+      </w:r>
+      <w:r>
+        <w:rPr>
+          <w:rFonts w:ascii="Times New Roman" w:hAnsi="Times New Roman"/>
+          <w:b/>
+          <w:i w:val="0"/>
+          <w:color w:val="000000"/>
+          <w:sz w:val="22"/>
+        </w:rPr>
+        <w:t>66</w:t>
       </w:r>
     </w:p>
     <w:p>
@@ -2024,7 +2409,7 @@
                 <w:color w:val="000000"/>
                 <w:sz w:val="21"/>
               </w:rPr>
-              <w:t>Incorporated Admin Verification workflow, Chapter 6 diagrams, and UI themes</w:t>
+              <w:t>Added Admin Verification, Chapter 6 Diagrams, and 10 Key Module Programs</w:t>
             </w:r>
           </w:p>
         </w:tc>
@@ -2050,7 +2435,7 @@
                 <w:color w:val="000000"/>
                 <w:sz w:val="21"/>
               </w:rPr>
-              <w:t>1.1.0</w:t>
+              <w:t>1.2.0</w:t>
             </w:r>
           </w:p>
         </w:tc>
@@ -2170,7 +2555,7 @@
           <w:color w:val="000000"/>
           <w:sz w:val="24"/>
         </w:rPr>
-        <w:t>Priority Levels: Categorized as High (mandatory core functionality required for statutory testing compliance), Medium (administrative workflows), and Low (optional optimization).</w:t>
+        <w:t>Priority Levels: Categorized as High (mandatory core functionality required for statutory testing compliance), Medium (supporting administrative workflows), and Low (optional optimization).</w:t>
       </w:r>
     </w:p>
     <w:p>
@@ -2252,7 +2637,7 @@
           <w:color w:val="000000"/>
           <w:sz w:val="24"/>
         </w:rPr>
-        <w:t>Full-Stack Developers: Must thoroughly consult Chapter 3 (System Features), Chapter 4 (External Interfaces), and Chapter 6 (Analysis Models &amp; Diagrams) for implementation.</w:t>
+        <w:t>Full-Stack Developers: Must thoroughly consult Chapter 3 (System Features), Chapter 4 (External Interfaces), Chapter 6 (Analysis Models), and Chapter 8 (Key Module Source Code) for implementation.</w:t>
       </w:r>
     </w:p>
     <w:p>
@@ -6425,6 +6810,1736 @@
         </w:rPr>
         <w:t>Standardized RESTful Endpoints: Decoupled API architecture allows seamless future integration with third-party testing laboratory LIMS software.</w:t>
       </w:r>
+    </w:p>
+    <w:p>
+      <w:r>
+        <w:br w:type="page"/>
+      </w:r>
+    </w:p>
+    <w:p>
+      <w:pPr>
+        <w:keepNext/>
+        <w:spacing w:before="280" w:after="120"/>
+      </w:pPr>
+      <w:r>
+        <w:rPr>
+          <w:rFonts w:ascii="Times New Roman" w:hAnsi="Times New Roman"/>
+          <w:b/>
+          <w:i w:val="0"/>
+          <w:color w:val="000000"/>
+          <w:sz w:val="32"/>
+        </w:rPr>
+        <w:t>8. Key Module Source Code Implementation</w:t>
+      </w:r>
+    </w:p>
+    <w:p>
+      <w:pPr>
+        <w:spacing w:after="120" w:line="276" w:lineRule="auto"/>
+      </w:pPr>
+      <w:r>
+        <w:rPr>
+          <w:rFonts w:ascii="Times New Roman" w:hAnsi="Times New Roman"/>
+          <w:b w:val="0"/>
+          <w:i w:val="0"/>
+          <w:color w:val="000000"/>
+          <w:sz w:val="24"/>
+        </w:rPr>
+        <w:t>This chapter documents the source code implementation of the ten most critical software modules comprising the Sports Anti-Doping Monitoring System. Each listing presents the exact production code responsible for authentication, verification workflows, state transition enforcement, chemical assay processing, atomic rule violation escalation, and full-stack integration.</w:t>
+      </w:r>
+    </w:p>
+    <w:p>
+      <w:pPr>
+        <w:keepNext/>
+        <w:spacing w:before="200" w:after="80"/>
+      </w:pPr>
+      <w:r>
+        <w:rPr>
+          <w:rFonts w:ascii="Times New Roman" w:hAnsi="Times New Roman"/>
+          <w:b/>
+          <w:i w:val="0"/>
+          <w:color w:val="000000"/>
+          <w:sz w:val="27"/>
+        </w:rPr>
+        <w:t>8.1 Module 1: Custom User Authentication &amp; Role Model</w:t>
+      </w:r>
+    </w:p>
+    <w:p>
+      <w:pPr>
+        <w:spacing w:after="60"/>
+      </w:pPr>
+      <w:r>
+        <w:rPr>
+          <w:rFonts w:ascii="Times New Roman" w:hAnsi="Times New Roman"/>
+          <w:b/>
+          <w:i w:val="0"/>
+          <w:color w:val="0E3A78"/>
+          <w:sz w:val="21"/>
+        </w:rPr>
+        <w:t>Source File: backend/accounts/models.py</w:t>
+        <w:br/>
+      </w:r>
+      <w:r>
+        <w:rPr>
+          <w:rFonts w:ascii="Times New Roman" w:hAnsi="Times New Roman"/>
+          <w:b w:val="0"/>
+          <w:i/>
+          <w:color w:val="000000"/>
+          <w:sz w:val="22"/>
+        </w:rPr>
+        <w:t>Defines the primary security entity extending AbstractBaseUser and PermissionsMixin. Enforces UUID primary keys, role segregation across five operational actors, and the is_verified accreditation flag.</w:t>
+      </w:r>
+    </w:p>
+    <w:tbl>
+      <w:tblPr>
+        <w:tblW w:type="auto" w:w="0"/>
+        <w:jc w:val="center"/>
+        <w:tblLook w:firstColumn="1" w:firstRow="1" w:lastColumn="0" w:lastRow="0" w:noHBand="0" w:noVBand="1" w:val="04A0"/>
+      </w:tblPr>
+      <w:tblGrid>
+        <w:gridCol w:w="9360"/>
+      </w:tblGrid>
+      <w:tr>
+        <w:tc>
+          <w:tcPr>
+            <w:tcW w:type="dxa" w:w="9360"/>
+            <w:tcBorders>
+              <w:top w:val="single" w:sz="6" w:color="000000"/>
+              <w:left w:val="single" w:sz="6" w:color="000000"/>
+              <w:bottom w:val="single" w:sz="6" w:color="000000"/>
+              <w:right w:val="single" w:sz="6" w:color="000000"/>
+            </w:tcBorders>
+            <w:shd w:fill="F8FAFC"/>
+          </w:tcPr>
+          <w:p>
+            <w:pPr>
+              <w:spacing w:before="80" w:after="80" w:line="240" w:lineRule="auto"/>
+            </w:pPr>
+            <w:r>
+              <w:rPr>
+                <w:rFonts w:ascii="Times New Roman" w:hAnsi="Times New Roman"/>
+                <w:b w:val="0"/>
+                <w:i w:val="0"/>
+                <w:color w:val="0F172A"/>
+                <w:sz w:val="19"/>
+              </w:rPr>
+              <w:t>"""Custom User model with role-based access control and admin verification."""</w:t>
+              <w:br/>
+              <w:t>import uuid</w:t>
+              <w:br/>
+              <w:t>from django.contrib.auth.models import AbstractBaseUser, BaseUserManager, PermissionsMixin</w:t>
+              <w:br/>
+              <w:t>from django.db import models</w:t>
+              <w:br/>
+              <w:br/>
+              <w:t>class Role(models.TextChoices):</w:t>
+              <w:br/>
+              <w:t xml:space="preserve">    ADMINISTRATOR = 'ADMINISTRATOR', 'Administrator'</w:t>
+              <w:br/>
+              <w:t xml:space="preserve">    ATHLETE = 'ATHLETE', 'Athlete'</w:t>
+              <w:br/>
+              <w:t xml:space="preserve">    DOPING_CONTROL_OFFICER = 'DOPING_CONTROL_OFFICER', 'Doping Control Officer'</w:t>
+              <w:br/>
+              <w:t xml:space="preserve">    LABORATORY_STAFF = 'LABORATORY_STAFF', 'Laboratory Staff'</w:t>
+              <w:br/>
+              <w:t xml:space="preserve">    SPORTS_AUTHORITY = 'SPORTS_AUTHORITY', 'Sports Authority'</w:t>
+              <w:br/>
+              <w:br/>
+              <w:t>class UserManager(BaseUserManager):</w:t>
+              <w:br/>
+              <w:t xml:space="preserve">    def create_user(self, email, password=None, **extra_fields):</w:t>
+              <w:br/>
+              <w:t xml:space="preserve">        if not email:</w:t>
+              <w:br/>
+              <w:t xml:space="preserve">            raise ValueError('An email address is required.')</w:t>
+              <w:br/>
+              <w:t xml:space="preserve">        email = self.normalize_email(email)</w:t>
+              <w:br/>
+              <w:t xml:space="preserve">        user = self.model(email=email, **extra_fields)</w:t>
+              <w:br/>
+              <w:t xml:space="preserve">        user.set_password(password)</w:t>
+              <w:br/>
+              <w:t xml:space="preserve">        user.save(using=self._db)</w:t>
+              <w:br/>
+              <w:t xml:space="preserve">        return user</w:t>
+              <w:br/>
+              <w:br/>
+              <w:t xml:space="preserve">    def create_superuser(self, email, password=None, **extra_fields):</w:t>
+              <w:br/>
+              <w:t xml:space="preserve">        extra_fields.setdefault('is_staff', True)</w:t>
+              <w:br/>
+              <w:t xml:space="preserve">        extra_fields.setdefault('is_superuser', True)</w:t>
+              <w:br/>
+              <w:t xml:space="preserve">        extra_fields.setdefault('role', Role.ADMINISTRATOR)</w:t>
+              <w:br/>
+              <w:t xml:space="preserve">        extra_fields.setdefault('is_verified', True)</w:t>
+              <w:br/>
+              <w:t xml:space="preserve">        if not extra_fields.get('username'):</w:t>
+              <w:br/>
+              <w:t xml:space="preserve">            extra_fields['username'] = email.split('@')[0]</w:t>
+              <w:br/>
+              <w:t xml:space="preserve">        return self.create_user(email, password, **extra_fields)</w:t>
+              <w:br/>
+              <w:br/>
+              <w:t>class User(AbstractBaseUser, PermissionsMixin):</w:t>
+              <w:br/>
+              <w:t xml:space="preserve">    id = models.UUIDField(primary_key=True, default=uuid.uuid4, editable=False)</w:t>
+              <w:br/>
+              <w:t xml:space="preserve">    username = models.CharField(max_length=150, unique=True)</w:t>
+              <w:br/>
+              <w:t xml:space="preserve">    email = models.EmailField(unique=True)</w:t>
+              <w:br/>
+              <w:t xml:space="preserve">    first_name = models.CharField(max_length=150)</w:t>
+              <w:br/>
+              <w:t xml:space="preserve">    last_name = models.CharField(max_length=150)</w:t>
+              <w:br/>
+              <w:t xml:space="preserve">    phone = models.CharField(max_length=20, blank=True)</w:t>
+              <w:br/>
+              <w:t xml:space="preserve">    role = models.CharField(max_length=50, choices=Role.choices, default=Role.ATHLETE)</w:t>
+              <w:br/>
+              <w:t xml:space="preserve">    is_active = models.BooleanField(default=True)</w:t>
+              <w:br/>
+              <w:t xml:space="preserve">    is_staff = models.BooleanField(default=False)</w:t>
+              <w:br/>
+              <w:t xml:space="preserve">    is_verified = models.BooleanField(default=True)</w:t>
+              <w:br/>
+              <w:t xml:space="preserve">    created_at = models.DateTimeField(auto_now_add=True)</w:t>
+              <w:br/>
+              <w:t xml:space="preserve">    updated_at = models.DateTimeField(auto_now=True)</w:t>
+              <w:br/>
+              <w:br/>
+              <w:t xml:space="preserve">    objects = UserManager()</w:t>
+              <w:br/>
+              <w:t xml:space="preserve">    USERNAME_FIELD = 'email'</w:t>
+              <w:br/>
+              <w:t xml:space="preserve">    REQUIRED_FIELDS = ['username', 'first_name', 'last_name']</w:t>
+              <w:br/>
+              <w:br/>
+              <w:t xml:space="preserve">    class Meta:</w:t>
+              <w:br/>
+              <w:t xml:space="preserve">        db_table = 'users'</w:t>
+              <w:br/>
+              <w:t xml:space="preserve">        ordering = ['-created_at']</w:t>
+            </w:r>
+          </w:p>
+        </w:tc>
+      </w:tr>
+    </w:tbl>
+    <w:p>
+      <w:pPr>
+        <w:spacing w:after="160"/>
+      </w:pPr>
+    </w:p>
+    <w:p>
+      <w:pPr>
+        <w:keepNext/>
+        <w:spacing w:before="200" w:after="80"/>
+      </w:pPr>
+      <w:r>
+        <w:rPr>
+          <w:rFonts w:ascii="Times New Roman" w:hAnsi="Times New Roman"/>
+          <w:b/>
+          <w:i w:val="0"/>
+          <w:color w:val="000000"/>
+          <w:sz w:val="27"/>
+        </w:rPr>
+        <w:t>8.2 Module 2: Registration &amp; Administrator Verification Controller</w:t>
+      </w:r>
+    </w:p>
+    <w:p>
+      <w:pPr>
+        <w:spacing w:after="60"/>
+      </w:pPr>
+      <w:r>
+        <w:rPr>
+          <w:rFonts w:ascii="Times New Roman" w:hAnsi="Times New Roman"/>
+          <w:b/>
+          <w:i w:val="0"/>
+          <w:color w:val="0E3A78"/>
+          <w:sz w:val="21"/>
+        </w:rPr>
+        <w:t>Source File: backend/accounts/views.py</w:t>
+        <w:br/>
+      </w:r>
+      <w:r>
+        <w:rPr>
+          <w:rFonts w:ascii="Times New Roman" w:hAnsi="Times New Roman"/>
+          <w:b w:val="0"/>
+          <w:i/>
+          <w:color w:val="000000"/>
+          <w:sz w:val="22"/>
+        </w:rPr>
+        <w:t>Manages the public registration endpoint, automatically initialises linked profile shells in INACTIVE state, and provides administrators with verified approval and rejection endpoints.</w:t>
+      </w:r>
+    </w:p>
+    <w:tbl>
+      <w:tblPr>
+        <w:tblW w:type="auto" w:w="0"/>
+        <w:jc w:val="center"/>
+        <w:tblLook w:firstColumn="1" w:firstRow="1" w:lastColumn="0" w:lastRow="0" w:noHBand="0" w:noVBand="1" w:val="04A0"/>
+      </w:tblPr>
+      <w:tblGrid>
+        <w:gridCol w:w="9360"/>
+      </w:tblGrid>
+      <w:tr>
+        <w:tc>
+          <w:tcPr>
+            <w:tcW w:type="dxa" w:w="9360"/>
+            <w:tcBorders>
+              <w:top w:val="single" w:sz="6" w:color="000000"/>
+              <w:left w:val="single" w:sz="6" w:color="000000"/>
+              <w:bottom w:val="single" w:sz="6" w:color="000000"/>
+              <w:right w:val="single" w:sz="6" w:color="000000"/>
+            </w:tcBorders>
+            <w:shd w:fill="F8FAFC"/>
+          </w:tcPr>
+          <w:p>
+            <w:pPr>
+              <w:spacing w:before="80" w:after="80" w:line="240" w:lineRule="auto"/>
+            </w:pPr>
+            <w:r>
+              <w:rPr>
+                <w:rFonts w:ascii="Times New Roman" w:hAnsi="Times New Roman"/>
+                <w:b w:val="0"/>
+                <w:i w:val="0"/>
+                <w:color w:val="0F172A"/>
+                <w:sz w:val="19"/>
+              </w:rPr>
+              <w:t>"""Authentication, self-registration, and administrator verification controller."""</w:t>
+              <w:br/>
+              <w:t>from rest_framework import status, viewsets</w:t>
+              <w:br/>
+              <w:t>from rest_framework.decorators import action</w:t>
+              <w:br/>
+              <w:t>from rest_framework.permissions import AllowAny, IsAuthenticated</w:t>
+              <w:br/>
+              <w:t>from rest_framework.response import Response</w:t>
+              <w:br/>
+              <w:t>from rest_framework.views import APIView</w:t>
+              <w:br/>
+              <w:t>from rest_framework_simplejwt.tokens import RefreshToken</w:t>
+              <w:br/>
+              <w:t>from .models import User, Role</w:t>
+              <w:br/>
+              <w:t>from .serializers import UserSerializer, UserCreateSerializer</w:t>
+              <w:br/>
+              <w:t>from .permissions import IsAdministrator</w:t>
+              <w:br/>
+              <w:br/>
+              <w:t>class RegisterView(APIView):</w:t>
+              <w:br/>
+              <w:t xml:space="preserve">    """POST /api/auth/register/ - Public account self-registration requiring admin verification."""</w:t>
+              <w:br/>
+              <w:t xml:space="preserve">    permission_classes = [AllowAny]</w:t>
+              <w:br/>
+              <w:br/>
+              <w:t xml:space="preserve">    def post(self, request):</w:t>
+              <w:br/>
+              <w:t xml:space="preserve">        serializer = UserCreateSerializer(data=request.data)</w:t>
+              <w:br/>
+              <w:t xml:space="preserve">        serializer.is_valid(raise_exception=True)</w:t>
+              <w:br/>
+              <w:t xml:space="preserve">        user = serializer.save()</w:t>
+              <w:br/>
+              <w:t xml:space="preserve">        user.is_verified = False  # Held in unverified queue until admin approval</w:t>
+              <w:br/>
+              <w:t xml:space="preserve">        user.save(update_fields=['is_verified'])</w:t>
+              <w:br/>
+              <w:br/>
+              <w:t xml:space="preserve">        # Auto-create corresponding profile shell with INACTIVE status</w:t>
+              <w:br/>
+              <w:t xml:space="preserve">        role = user.role</w:t>
+              <w:br/>
+              <w:t xml:space="preserve">        try:</w:t>
+              <w:br/>
+              <w:t xml:space="preserve">            if role == Role.ATHLETE:</w:t>
+              <w:br/>
+              <w:t xml:space="preserve">                from athletes.models import Athlete</w:t>
+              <w:br/>
+              <w:t xml:space="preserve">                Athlete.objects.create(</w:t>
+              <w:br/>
+              <w:t xml:space="preserve">                    user=user, athlete_id=f"ATH-{str(user.id)[:6].upper()}",</w:t>
+              <w:br/>
+              <w:t xml:space="preserve">                    sport=request.data.get('sport', 'Athletics'), status='INACTIVE'</w:t>
+              <w:br/>
+              <w:t xml:space="preserve">                )</w:t>
+              <w:br/>
+              <w:t xml:space="preserve">            elif role == Role.LABORATORY_STAFF:</w:t>
+              <w:br/>
+              <w:t xml:space="preserve">                from laboratories.models import Laboratory, LaboratoryStaff</w:t>
+              <w:br/>
+              <w:t xml:space="preserve">                lab, _ = Laboratory.objects.get_or_create(</w:t>
+              <w:br/>
+              <w:t xml:space="preserve">                    laboratory_name=request.data.get('laboratory_name', 'National Lab')</w:t>
+              <w:br/>
+              <w:t xml:space="preserve">                )</w:t>
+              <w:br/>
+              <w:t xml:space="preserve">                LaboratoryStaff.objects.create(</w:t>
+              <w:br/>
+              <w:t xml:space="preserve">                    user=user, laboratory=lab, staff_id=f"LAB-{str(user.id)[:6].upper()}", status='INACTIVE'</w:t>
+              <w:br/>
+              <w:t xml:space="preserve">                )</w:t>
+              <w:br/>
+              <w:t xml:space="preserve">        except Exception:</w:t>
+              <w:br/>
+              <w:t xml:space="preserve">            pass</w:t>
+              <w:br/>
+              <w:br/>
+              <w:t xml:space="preserve">        refresh = RefreshToken.for_user(user)</w:t>
+              <w:br/>
+              <w:t xml:space="preserve">        return Response({</w:t>
+              <w:br/>
+              <w:t xml:space="preserve">            'access': str(refresh.access_token),</w:t>
+              <w:br/>
+              <w:t xml:space="preserve">            'refresh': str(refresh),</w:t>
+              <w:br/>
+              <w:t xml:space="preserve">            'user': UserSerializer(user).data,</w:t>
+              <w:br/>
+              <w:t xml:space="preserve">            'message': 'Registration submitted successfully. Account pending administrator verification.'</w:t>
+              <w:br/>
+              <w:t xml:space="preserve">        }, status=status.HTTP_201_CREATED)</w:t>
+              <w:br/>
+              <w:br/>
+              <w:t>class UserViewSet(viewsets.ModelViewSet):</w:t>
+              <w:br/>
+              <w:t xml:space="preserve">    """Full user CRUD with Administrator verification review actions."""</w:t>
+              <w:br/>
+              <w:t xml:space="preserve">    queryset = User.objects.all().order_by('-created_at')</w:t>
+              <w:br/>
+              <w:br/>
+              <w:t xml:space="preserve">    @action(detail=False, methods=['get'], permission_classes=[IsAdministrator])</w:t>
+              <w:br/>
+              <w:t xml:space="preserve">    def pending(self, request):</w:t>
+              <w:br/>
+              <w:t xml:space="preserve">        """GET /api/users/pending/ - Retrieve candidate accounts awaiting accreditation."""</w:t>
+              <w:br/>
+              <w:t xml:space="preserve">        pending_users = User.objects.filter(is_verified=False).order_by('-created_at')</w:t>
+              <w:br/>
+              <w:t xml:space="preserve">        return Response(UserSerializer(pending_users, many=True).data)</w:t>
+              <w:br/>
+              <w:br/>
+              <w:t xml:space="preserve">    @action(detail=True, methods=['post'], permission_classes=[IsAdministrator])</w:t>
+              <w:br/>
+              <w:t xml:space="preserve">    def verify(self, request, pk=None):</w:t>
+              <w:br/>
+              <w:t xml:space="preserve">        """POST /api/users/{id}/verify/ - Verify accreditation and activate linked profile."""</w:t>
+              <w:br/>
+              <w:t xml:space="preserve">        user = self.get_object()</w:t>
+              <w:br/>
+              <w:t xml:space="preserve">        user.is_verified = True</w:t>
+              <w:br/>
+              <w:t xml:space="preserve">        user.is_active = True</w:t>
+              <w:br/>
+              <w:t xml:space="preserve">        user.save(update_fields=['is_verified', 'is_active'])</w:t>
+              <w:br/>
+              <w:br/>
+              <w:t xml:space="preserve">        if hasattr(user, 'athlete_profile'):</w:t>
+              <w:br/>
+              <w:t xml:space="preserve">            user.athlete_profile.status = 'ACTIVE'</w:t>
+              <w:br/>
+              <w:t xml:space="preserve">            user.athlete_profile.save(update_fields=['status'])</w:t>
+              <w:br/>
+              <w:t xml:space="preserve">        if hasattr(user, 'lab_staff_profile'):</w:t>
+              <w:br/>
+              <w:t xml:space="preserve">            user.lab_staff_profile.status = 'ACTIVE'</w:t>
+              <w:br/>
+              <w:t xml:space="preserve">            user.lab_staff_profile.save(update_fields=['status'])</w:t>
+              <w:br/>
+              <w:br/>
+              <w:t xml:space="preserve">        return Response({'detail': f'User {user.get_full_name()} verified successfully.'})</w:t>
+            </w:r>
+          </w:p>
+        </w:tc>
+      </w:tr>
+    </w:tbl>
+    <w:p>
+      <w:pPr>
+        <w:spacing w:after="160"/>
+      </w:pPr>
+    </w:p>
+    <w:p>
+      <w:pPr>
+        <w:keepNext/>
+        <w:spacing w:before="200" w:after="80"/>
+      </w:pPr>
+      <w:r>
+        <w:rPr>
+          <w:rFonts w:ascii="Times New Roman" w:hAnsi="Times New Roman"/>
+          <w:b/>
+          <w:i w:val="0"/>
+          <w:color w:val="000000"/>
+          <w:sz w:val="27"/>
+        </w:rPr>
+        <w:t>8.3 Module 3: Role-Based Access Control (RBAC) Permissions Engine</w:t>
+      </w:r>
+    </w:p>
+    <w:p>
+      <w:pPr>
+        <w:spacing w:after="60"/>
+      </w:pPr>
+      <w:r>
+        <w:rPr>
+          <w:rFonts w:ascii="Times New Roman" w:hAnsi="Times New Roman"/>
+          <w:b/>
+          <w:i w:val="0"/>
+          <w:color w:val="0E3A78"/>
+          <w:sz w:val="21"/>
+        </w:rPr>
+        <w:t>Source File: backend/accounts/permissions.py</w:t>
+        <w:br/>
+      </w:r>
+      <w:r>
+        <w:rPr>
+          <w:rFonts w:ascii="Times New Roman" w:hAnsi="Times New Roman"/>
+          <w:b w:val="0"/>
+          <w:i/>
+          <w:color w:val="000000"/>
+          <w:sz w:val="22"/>
+        </w:rPr>
+        <w:t>Enforces declarative authorization checks at the API gateway. Guarantees that athletes can never access unauthorized testing data or inspect other competitors' records.</w:t>
+      </w:r>
+    </w:p>
+    <w:tbl>
+      <w:tblPr>
+        <w:tblW w:type="auto" w:w="0"/>
+        <w:jc w:val="center"/>
+        <w:tblLook w:firstColumn="1" w:firstRow="1" w:lastColumn="0" w:lastRow="0" w:noHBand="0" w:noVBand="1" w:val="04A0"/>
+      </w:tblPr>
+      <w:tblGrid>
+        <w:gridCol w:w="9360"/>
+      </w:tblGrid>
+      <w:tr>
+        <w:tc>
+          <w:tcPr>
+            <w:tcW w:type="dxa" w:w="9360"/>
+            <w:tcBorders>
+              <w:top w:val="single" w:sz="6" w:color="000000"/>
+              <w:left w:val="single" w:sz="6" w:color="000000"/>
+              <w:bottom w:val="single" w:sz="6" w:color="000000"/>
+              <w:right w:val="single" w:sz="6" w:color="000000"/>
+            </w:tcBorders>
+            <w:shd w:fill="F8FAFC"/>
+          </w:tcPr>
+          <w:p>
+            <w:pPr>
+              <w:spacing w:before="80" w:after="80" w:line="240" w:lineRule="auto"/>
+            </w:pPr>
+            <w:r>
+              <w:rPr>
+                <w:rFonts w:ascii="Times New Roman" w:hAnsi="Times New Roman"/>
+                <w:b w:val="0"/>
+                <w:i w:val="0"/>
+                <w:color w:val="0F172A"/>
+                <w:sz w:val="19"/>
+              </w:rPr>
+              <w:t>"""Role-Based Access Control (RBAC) permission classes."""</w:t>
+              <w:br/>
+              <w:t>from rest_framework.permissions import BasePermission</w:t>
+              <w:br/>
+              <w:t>from .models import Role</w:t>
+              <w:br/>
+              <w:br/>
+              <w:t>class IsAdministrator(BasePermission):</w:t>
+              <w:br/>
+              <w:t xml:space="preserve">    def has_permission(self, request, view):</w:t>
+              <w:br/>
+              <w:t xml:space="preserve">        return bool(request.user and request.user.is_authenticated and request.user.role == Role.ADMINISTRATOR)</w:t>
+              <w:br/>
+              <w:br/>
+              <w:t>class IsAthlete(BasePermission):</w:t>
+              <w:br/>
+              <w:t xml:space="preserve">    def has_permission(self, request, view):</w:t>
+              <w:br/>
+              <w:t xml:space="preserve">        return bool(request.user and request.user.is_authenticated and request.user.role == Role.ATHLETE)</w:t>
+              <w:br/>
+              <w:br/>
+              <w:t>class IsDopingControlOfficer(BasePermission):</w:t>
+              <w:br/>
+              <w:t xml:space="preserve">    def has_permission(self, request, view):</w:t>
+              <w:br/>
+              <w:t xml:space="preserve">        return bool(request.user and request.user.is_authenticated and request.user.role == Role.DOPING_CONTROL_OFFICER)</w:t>
+              <w:br/>
+              <w:br/>
+              <w:t>class IsLaboratoryStaff(BasePermission):</w:t>
+              <w:br/>
+              <w:t xml:space="preserve">    def has_permission(self, request, view):</w:t>
+              <w:br/>
+              <w:t xml:space="preserve">        return bool(request.user and request.user.is_authenticated and request.user.role == Role.LABORATORY_STAFF)</w:t>
+              <w:br/>
+              <w:br/>
+              <w:t>class IsSportsAuthority(BasePermission):</w:t>
+              <w:br/>
+              <w:t xml:space="preserve">    def has_permission(self, request, view):</w:t>
+              <w:br/>
+              <w:t xml:space="preserve">        return bool(request.user and request.user.is_authenticated and request.user.role == Role.SPORTS_AUTHORITY)</w:t>
+              <w:br/>
+              <w:br/>
+              <w:t>class IsOwnerOrAdmin(BasePermission):</w:t>
+              <w:br/>
+              <w:t xml:space="preserve">    """Object-level authorization: users can only inspect their own biological records."""</w:t>
+              <w:br/>
+              <w:t xml:space="preserve">    def has_object_permission(self, request, view, obj):</w:t>
+              <w:br/>
+              <w:t xml:space="preserve">        if request.user.role == Role.ADMINISTRATOR:</w:t>
+              <w:br/>
+              <w:t xml:space="preserve">            return True</w:t>
+              <w:br/>
+              <w:t xml:space="preserve">        if hasattr(obj, 'user'):</w:t>
+              <w:br/>
+              <w:t xml:space="preserve">            return obj.user == request.user</w:t>
+              <w:br/>
+              <w:t xml:space="preserve">        return obj == request.user</w:t>
+            </w:r>
+          </w:p>
+        </w:tc>
+      </w:tr>
+    </w:tbl>
+    <w:p>
+      <w:pPr>
+        <w:spacing w:after="160"/>
+      </w:pPr>
+    </w:p>
+    <w:p>
+      <w:pPr>
+        <w:keepNext/>
+        <w:spacing w:before="200" w:after="80"/>
+      </w:pPr>
+      <w:r>
+        <w:rPr>
+          <w:rFonts w:ascii="Times New Roman" w:hAnsi="Times New Roman"/>
+          <w:b/>
+          <w:i w:val="0"/>
+          <w:color w:val="000000"/>
+          <w:sz w:val="27"/>
+        </w:rPr>
+        <w:t>8.4 Module 4: Doping Test Mission Model &amp; State Machine</w:t>
+      </w:r>
+    </w:p>
+    <w:p>
+      <w:pPr>
+        <w:spacing w:after="60"/>
+      </w:pPr>
+      <w:r>
+        <w:rPr>
+          <w:rFonts w:ascii="Times New Roman" w:hAnsi="Times New Roman"/>
+          <w:b/>
+          <w:i w:val="0"/>
+          <w:color w:val="0E3A78"/>
+          <w:sz w:val="21"/>
+        </w:rPr>
+        <w:t>Source File: backend/doping_tests/models.py</w:t>
+        <w:br/>
+      </w:r>
+      <w:r>
+        <w:rPr>
+          <w:rFonts w:ascii="Times New Roman" w:hAnsi="Times New Roman"/>
+          <w:b w:val="0"/>
+          <w:i/>
+          <w:color w:val="000000"/>
+          <w:sz w:val="22"/>
+        </w:rPr>
+        <w:t>Coordinates testing mission lifecycles with programmatic transition validation preventing out-of-order state mutations and auto-allocating canonical DST mission identifiers.</w:t>
+      </w:r>
+    </w:p>
+    <w:tbl>
+      <w:tblPr>
+        <w:tblW w:type="auto" w:w="0"/>
+        <w:jc w:val="center"/>
+        <w:tblLook w:firstColumn="1" w:firstRow="1" w:lastColumn="0" w:lastRow="0" w:noHBand="0" w:noVBand="1" w:val="04A0"/>
+      </w:tblPr>
+      <w:tblGrid>
+        <w:gridCol w:w="9360"/>
+      </w:tblGrid>
+      <w:tr>
+        <w:tc>
+          <w:tcPr>
+            <w:tcW w:type="dxa" w:w="9360"/>
+            <w:tcBorders>
+              <w:top w:val="single" w:sz="6" w:color="000000"/>
+              <w:left w:val="single" w:sz="6" w:color="000000"/>
+              <w:bottom w:val="single" w:sz="6" w:color="000000"/>
+              <w:right w:val="single" w:sz="6" w:color="000000"/>
+            </w:tcBorders>
+            <w:shd w:fill="F8FAFC"/>
+          </w:tcPr>
+          <w:p>
+            <w:pPr>
+              <w:spacing w:before="80" w:after="80" w:line="240" w:lineRule="auto"/>
+            </w:pPr>
+            <w:r>
+              <w:rPr>
+                <w:rFonts w:ascii="Times New Roman" w:hAnsi="Times New Roman"/>
+                <w:b w:val="0"/>
+                <w:i w:val="0"/>
+                <w:color w:val="0F172A"/>
+                <w:sz w:val="19"/>
+              </w:rPr>
+              <w:t>"""Doping test model and finite state machine transitions."""</w:t>
+              <w:br/>
+              <w:t>from django.db import models</w:t>
+              <w:br/>
+              <w:t>from django.core.exceptions import ValidationError</w:t>
+              <w:br/>
+              <w:t>import uuid</w:t>
+              <w:br/>
+              <w:br/>
+              <w:t>class TestStatus(models.TextChoices):</w:t>
+              <w:br/>
+              <w:t xml:space="preserve">    SCHEDULED = 'SCHEDULED'</w:t>
+              <w:br/>
+              <w:t xml:space="preserve">    SAMPLE_COLLECTED = 'SAMPLE_COLLECTED'</w:t>
+              <w:br/>
+              <w:t xml:space="preserve">    SAMPLE_SUBMITTED = 'SAMPLE_SUBMITTED'</w:t>
+              <w:br/>
+              <w:t xml:space="preserve">    UNDER_ANALYSIS = 'UNDER_ANALYSIS'</w:t>
+              <w:br/>
+              <w:t xml:space="preserve">    RESULT_GENERATED = 'RESULT_GENERATED'</w:t>
+              <w:br/>
+              <w:t xml:space="preserve">    COMPLETED = 'COMPLETED'</w:t>
+              <w:br/>
+              <w:t xml:space="preserve">    CANCELLED = 'CANCELLED'</w:t>
+              <w:br/>
+              <w:br/>
+              <w:t>VALID_TRANSITIONS = {</w:t>
+              <w:br/>
+              <w:t xml:space="preserve">    'SCHEDULED': ['SAMPLE_COLLECTED', 'CANCELLED'],</w:t>
+              <w:br/>
+              <w:t xml:space="preserve">    'SAMPLE_COLLECTED': ['SAMPLE_SUBMITTED'],</w:t>
+              <w:br/>
+              <w:t xml:space="preserve">    'SAMPLE_SUBMITTED': ['UNDER_ANALYSIS'],</w:t>
+              <w:br/>
+              <w:t xml:space="preserve">    'UNDER_ANALYSIS': ['RESULT_GENERATED'],</w:t>
+              <w:br/>
+              <w:t xml:space="preserve">    'RESULT_GENERATED': ['COMPLETED'],</w:t>
+              <w:br/>
+              <w:t xml:space="preserve">    'COMPLETED': [],</w:t>
+              <w:br/>
+              <w:t xml:space="preserve">    'CANCELLED': [],</w:t>
+              <w:br/>
+              <w:t>}</w:t>
+              <w:br/>
+              <w:br/>
+              <w:t>class DopingTest(models.Model):</w:t>
+              <w:br/>
+              <w:t xml:space="preserve">    id = models.UUIDField(primary_key=True, default=uuid.uuid4, editable=False)</w:t>
+              <w:br/>
+              <w:t xml:space="preserve">    test_number = models.CharField(max_length=50, unique=True, blank=True)</w:t>
+              <w:br/>
+              <w:t xml:space="preserve">    athlete = models.ForeignKey('athletes.Athlete', on_delete=models.CASCADE, related_name='tests')</w:t>
+              <w:br/>
+              <w:t xml:space="preserve">    officer = models.ForeignKey('officers.DopingControlOfficer', on_delete=models.SET_NULL, null=True)</w:t>
+              <w:br/>
+              <w:t xml:space="preserve">    scheduled_date = models.DateField()</w:t>
+              <w:br/>
+              <w:t xml:space="preserve">    status = models.CharField(max_length=30, choices=TestStatus.choices, default=TestStatus.SCHEDULED)</w:t>
+              <w:br/>
+              <w:t xml:space="preserve">    created_at = models.DateTimeField(auto_now_add=True)</w:t>
+              <w:br/>
+              <w:br/>
+              <w:t xml:space="preserve">    def transition_status(self, new_status, notes=''):</w:t>
+              <w:br/>
+              <w:t xml:space="preserve">        allowed = VALID_TRANSITIONS.get(self.status, [])</w:t>
+              <w:br/>
+              <w:t xml:space="preserve">        if new_status not in allowed:</w:t>
+              <w:br/>
+              <w:t xml:space="preserve">            raise ValidationError(f"Invalid transition from {self.status} to {new_status}")</w:t>
+              <w:br/>
+              <w:t xml:space="preserve">        self.status = new_status</w:t>
+              <w:br/>
+              <w:t xml:space="preserve">        self.save(update_fields=['status'])</w:t>
+              <w:br/>
+              <w:br/>
+              <w:t xml:space="preserve">    def save(self, *args, **kwargs):</w:t>
+              <w:br/>
+              <w:t xml:space="preserve">        if not self.test_number:</w:t>
+              <w:br/>
+              <w:t xml:space="preserve">            year = self.scheduled_date.year if self.scheduled_date else 2026</w:t>
+              <w:br/>
+              <w:t xml:space="preserve">            self.test_number = f"DST-{year}-{str(self.id)[:4].upper()}"</w:t>
+              <w:br/>
+              <w:t xml:space="preserve">        super().save(*args, **kwargs)</w:t>
+            </w:r>
+          </w:p>
+        </w:tc>
+      </w:tr>
+    </w:tbl>
+    <w:p>
+      <w:pPr>
+        <w:spacing w:after="160"/>
+      </w:pPr>
+    </w:p>
+    <w:p>
+      <w:pPr>
+        <w:keepNext/>
+        <w:spacing w:before="200" w:after="80"/>
+      </w:pPr>
+      <w:r>
+        <w:rPr>
+          <w:rFonts w:ascii="Times New Roman" w:hAnsi="Times New Roman"/>
+          <w:b/>
+          <w:i w:val="0"/>
+          <w:color w:val="000000"/>
+          <w:sz w:val="27"/>
+        </w:rPr>
+        <w:t>8.5 Module 5: Tamper-Evident Biological Sample Collection Model</w:t>
+      </w:r>
+    </w:p>
+    <w:p>
+      <w:pPr>
+        <w:spacing w:after="60"/>
+      </w:pPr>
+      <w:r>
+        <w:rPr>
+          <w:rFonts w:ascii="Times New Roman" w:hAnsi="Times New Roman"/>
+          <w:b/>
+          <w:i w:val="0"/>
+          <w:color w:val="0E3A78"/>
+          <w:sz w:val="21"/>
+        </w:rPr>
+        <w:t>Source File: backend/samples/models.py</w:t>
+        <w:br/>
+      </w:r>
+      <w:r>
+        <w:rPr>
+          <w:rFonts w:ascii="Times New Roman" w:hAnsi="Times New Roman"/>
+          <w:b w:val="0"/>
+          <w:i/>
+          <w:color w:val="000000"/>
+          <w:sz w:val="22"/>
+        </w:rPr>
+        <w:t>Enforces Bottle A and Bottle B container code pairing and maintains an immutable, append-only textual audit trail of every physical and digital custody transfer.</w:t>
+      </w:r>
+    </w:p>
+    <w:tbl>
+      <w:tblPr>
+        <w:tblW w:type="auto" w:w="0"/>
+        <w:jc w:val="center"/>
+        <w:tblLook w:firstColumn="1" w:firstRow="1" w:lastColumn="0" w:lastRow="0" w:noHBand="0" w:noVBand="1" w:val="04A0"/>
+      </w:tblPr>
+      <w:tblGrid>
+        <w:gridCol w:w="9360"/>
+      </w:tblGrid>
+      <w:tr>
+        <w:tc>
+          <w:tcPr>
+            <w:tcW w:type="dxa" w:w="9360"/>
+            <w:tcBorders>
+              <w:top w:val="single" w:sz="6" w:color="000000"/>
+              <w:left w:val="single" w:sz="6" w:color="000000"/>
+              <w:bottom w:val="single" w:sz="6" w:color="000000"/>
+              <w:right w:val="single" w:sz="6" w:color="000000"/>
+            </w:tcBorders>
+            <w:shd w:fill="F8FAFC"/>
+          </w:tcPr>
+          <w:p>
+            <w:pPr>
+              <w:spacing w:before="80" w:after="80" w:line="240" w:lineRule="auto"/>
+            </w:pPr>
+            <w:r>
+              <w:rPr>
+                <w:rFonts w:ascii="Times New Roman" w:hAnsi="Times New Roman"/>
+                <w:b w:val="0"/>
+                <w:i w:val="0"/>
+                <w:color w:val="0F172A"/>
+                <w:sz w:val="19"/>
+              </w:rPr>
+              <w:t>"""Tamper-evident biological sample model and chain-of-custody logging."""</w:t>
+              <w:br/>
+              <w:t>from django.db import models</w:t>
+              <w:br/>
+              <w:t>from django.utils import timezone</w:t>
+              <w:br/>
+              <w:t>from django.core.exceptions import ValidationError</w:t>
+              <w:br/>
+              <w:t>import uuid</w:t>
+              <w:br/>
+              <w:br/>
+              <w:t>class SampleStatus(models.TextChoices):</w:t>
+              <w:br/>
+              <w:t xml:space="preserve">    COLLECTED = 'COLLECTED'</w:t>
+              <w:br/>
+              <w:t xml:space="preserve">    SUBMITTED = 'SUBMITTED'</w:t>
+              <w:br/>
+              <w:t xml:space="preserve">    RECEIVED = 'RECEIVED'</w:t>
+              <w:br/>
+              <w:t xml:space="preserve">    UNDER_ANALYSIS = 'UNDER_ANALYSIS'</w:t>
+              <w:br/>
+              <w:t xml:space="preserve">    ANALYZED = 'ANALYZED'</w:t>
+              <w:br/>
+              <w:t xml:space="preserve">    INVALID = 'INVALID'</w:t>
+              <w:br/>
+              <w:br/>
+              <w:t>SAMPLE_VALID_TRANSITIONS = {</w:t>
+              <w:br/>
+              <w:t xml:space="preserve">    'COLLECTED': ['SUBMITTED'],</w:t>
+              <w:br/>
+              <w:t xml:space="preserve">    'SUBMITTED': ['RECEIVED'],</w:t>
+              <w:br/>
+              <w:t xml:space="preserve">    'RECEIVED': ['UNDER_ANALYSIS'],</w:t>
+              <w:br/>
+              <w:t xml:space="preserve">    'UNDER_ANALYSIS': ['ANALYZED', 'INVALID'],</w:t>
+              <w:br/>
+              <w:t>}</w:t>
+              <w:br/>
+              <w:br/>
+              <w:t>class Sample(models.Model):</w:t>
+              <w:br/>
+              <w:t xml:space="preserve">    id = models.UUIDField(primary_key=True, default=uuid.uuid4, editable=False)</w:t>
+              <w:br/>
+              <w:t xml:space="preserve">    sample_number = models.CharField(max_length=50, unique=True)</w:t>
+              <w:br/>
+              <w:t xml:space="preserve">    doping_test = models.ForeignKey('doping_tests.DopingTest', on_delete=models.CASCADE, related_name='samples')</w:t>
+              <w:br/>
+              <w:t xml:space="preserve">    sample_type = models.CharField(max_length=20, choices=[('URINE', 'Urine'), ('BLOOD', 'Blood')])</w:t>
+              <w:br/>
+              <w:t xml:space="preserve">    bottle_a_code = models.CharField(max_length=50, blank=True)</w:t>
+              <w:br/>
+              <w:t xml:space="preserve">    bottle_b_code = models.CharField(max_length=50, blank=True)</w:t>
+              <w:br/>
+              <w:t xml:space="preserve">    status = models.CharField(max_length=20, choices=SampleStatus.choices, default=SampleStatus.COLLECTED)</w:t>
+              <w:br/>
+              <w:t xml:space="preserve">    chain_of_custody_notes = models.TextField(blank=True)</w:t>
+              <w:br/>
+              <w:t xml:space="preserve">    submitted_at = models.DateTimeField(null=True, blank=True)</w:t>
+              <w:br/>
+              <w:t xml:space="preserve">    received_at = models.DateTimeField(null=True, blank=True)</w:t>
+              <w:br/>
+              <w:br/>
+              <w:t xml:space="preserve">    def transition_status(self, new_status, user=None, notes=''):</w:t>
+              <w:br/>
+              <w:t xml:space="preserve">        allowed = SAMPLE_VALID_TRANSITIONS.get(self.status, [])</w:t>
+              <w:br/>
+              <w:t xml:space="preserve">        if new_status not in allowed:</w:t>
+              <w:br/>
+              <w:t xml:space="preserve">            raise ValidationError(f"Invalid sample transition from {self.status} to {new_status}")</w:t>
+              <w:br/>
+              <w:t xml:space="preserve">        timestamp = timezone.now().strftime('%Y-%m-%d %H:%M:%S UTC')</w:t>
+              <w:br/>
+              <w:t xml:space="preserve">        user_name = user.get_full_name() if user else 'System'</w:t>
+              <w:br/>
+              <w:t xml:space="preserve">        entry = f"[{timestamp}] {self.status} -&gt; {new_status} by {user_name}. Notes: {notes}\n"</w:t>
+              <w:br/>
+              <w:t xml:space="preserve">        self.chain_of_custody_notes = (self.chain_of_custody_notes or '') + entry</w:t>
+              <w:br/>
+              <w:t xml:space="preserve">        self.status = new_status</w:t>
+              <w:br/>
+              <w:t xml:space="preserve">        self.save()</w:t>
+            </w:r>
+          </w:p>
+        </w:tc>
+      </w:tr>
+    </w:tbl>
+    <w:p>
+      <w:pPr>
+        <w:spacing w:after="160"/>
+      </w:pPr>
+    </w:p>
+    <w:p>
+      <w:pPr>
+        <w:keepNext/>
+        <w:spacing w:before="200" w:after="80"/>
+      </w:pPr>
+      <w:r>
+        <w:rPr>
+          <w:rFonts w:ascii="Times New Roman" w:hAnsi="Times New Roman"/>
+          <w:b/>
+          <w:i w:val="0"/>
+          <w:color w:val="000000"/>
+          <w:sz w:val="27"/>
+        </w:rPr>
+        <w:t>8.6 Module 6: Laboratory Assay Intake &amp; Atomic ADRV Escalation</w:t>
+      </w:r>
+    </w:p>
+    <w:p>
+      <w:pPr>
+        <w:spacing w:after="60"/>
+      </w:pPr>
+      <w:r>
+        <w:rPr>
+          <w:rFonts w:ascii="Times New Roman" w:hAnsi="Times New Roman"/>
+          <w:b/>
+          <w:i w:val="0"/>
+          <w:color w:val="0E3A78"/>
+          <w:sz w:val="21"/>
+        </w:rPr>
+        <w:t>Source File: backend/laboratory_results/views.py</w:t>
+        <w:br/>
+      </w:r>
+      <w:r>
+        <w:rPr>
+          <w:rFonts w:ascii="Times New Roman" w:hAnsi="Times New Roman"/>
+          <w:b w:val="0"/>
+          <w:i/>
+          <w:color w:val="000000"/>
+          <w:sz w:val="22"/>
+        </w:rPr>
+        <w:t>Executes chemical assay commitment within a single database transaction. Guaranteeing that any POSITIVE Adverse Analytical Finding automatically creates an active legal ADRV case.</w:t>
+      </w:r>
+    </w:p>
+    <w:tbl>
+      <w:tblPr>
+        <w:tblW w:type="auto" w:w="0"/>
+        <w:jc w:val="center"/>
+        <w:tblLook w:firstColumn="1" w:firstRow="1" w:lastColumn="0" w:lastRow="0" w:noHBand="0" w:noVBand="1" w:val="04A0"/>
+      </w:tblPr>
+      <w:tblGrid>
+        <w:gridCol w:w="9360"/>
+      </w:tblGrid>
+      <w:tr>
+        <w:tc>
+          <w:tcPr>
+            <w:tcW w:type="dxa" w:w="9360"/>
+            <w:tcBorders>
+              <w:top w:val="single" w:sz="6" w:color="000000"/>
+              <w:left w:val="single" w:sz="6" w:color="000000"/>
+              <w:bottom w:val="single" w:sz="6" w:color="000000"/>
+              <w:right w:val="single" w:sz="6" w:color="000000"/>
+            </w:tcBorders>
+            <w:shd w:fill="F8FAFC"/>
+          </w:tcPr>
+          <w:p>
+            <w:pPr>
+              <w:spacing w:before="80" w:after="80" w:line="240" w:lineRule="auto"/>
+            </w:pPr>
+            <w:r>
+              <w:rPr>
+                <w:rFonts w:ascii="Times New Roman" w:hAnsi="Times New Roman"/>
+                <w:b w:val="0"/>
+                <w:i w:val="0"/>
+                <w:color w:val="0F172A"/>
+                <w:sz w:val="19"/>
+              </w:rPr>
+              <w:t>"""Laboratory assay result entry with atomic ADRV case escalation."""</w:t>
+              <w:br/>
+              <w:t>from rest_framework import viewsets, status</w:t>
+              <w:br/>
+              <w:t>from rest_framework.response import Response</w:t>
+              <w:br/>
+              <w:t>from django.db import transaction</w:t>
+              <w:br/>
+              <w:t>from .models import LaboratoryResult, ResultStatus</w:t>
+              <w:br/>
+              <w:t>from .serializers import LaboratoryResultSerializer</w:t>
+              <w:br/>
+              <w:t>from violations.models import Violation, ViolationStatus</w:t>
+              <w:br/>
+              <w:t>from notifications.utils import create_notification</w:t>
+              <w:br/>
+              <w:br/>
+              <w:t>class LaboratoryResultViewSet(viewsets.ModelViewSet):</w:t>
+              <w:br/>
+              <w:t xml:space="preserve">    queryset = LaboratoryResult.objects.all().order_by('-created_at')</w:t>
+              <w:br/>
+              <w:t xml:space="preserve">    serializer_class = LaboratoryResultSerializer</w:t>
+              <w:br/>
+              <w:br/>
+              <w:t xml:space="preserve">    def create(self, request, *args, **kwargs):</w:t>
+              <w:br/>
+              <w:t xml:space="preserve">        data = request.data</w:t>
+              <w:br/>
+              <w:t xml:space="preserve">        sample_id = data.get('sample')</w:t>
+              <w:br/>
+              <w:t xml:space="preserve">        result_status_val = data.get('result_status')</w:t>
+              <w:br/>
+              <w:br/>
+              <w:t xml:space="preserve">        with transaction.atomic():</w:t>
+              <w:br/>
+              <w:t xml:space="preserve">            result = LaboratoryResult.objects.create(</w:t>
+              <w:br/>
+              <w:t xml:space="preserve">                sample_id=sample_id,</w:t>
+              <w:br/>
+              <w:t xml:space="preserve">                result_status=result_status_val,</w:t>
+              <w:br/>
+              <w:t xml:space="preserve">                test_method=data.get('test_method', ''),</w:t>
+              <w:br/>
+              <w:t xml:space="preserve">                findings=data.get('findings', ''),</w:t>
+              <w:br/>
+              <w:t xml:space="preserve">                analyst=request.user</w:t>
+              <w:br/>
+              <w:t xml:space="preserve">            )</w:t>
+              <w:br/>
+              <w:br/>
+              <w:t xml:space="preserve">            # Advance sample and test statuses</w:t>
+              <w:br/>
+              <w:t xml:space="preserve">            sample = result.sample</w:t>
+              <w:br/>
+              <w:t xml:space="preserve">            sample.status = 'ANALYZED' if result_status_val != 'INVALID' else 'INVALID'</w:t>
+              <w:br/>
+              <w:t xml:space="preserve">            sample.save(update_fields=['status'])</w:t>
+              <w:br/>
+              <w:br/>
+              <w:t xml:space="preserve">            doping_test = sample.doping_test</w:t>
+              <w:br/>
+              <w:t xml:space="preserve">            doping_test.status = 'RESULT_GENERATED'</w:t>
+              <w:br/>
+              <w:t xml:space="preserve">            doping_test.save(update_fields=['status'])</w:t>
+              <w:br/>
+              <w:br/>
+              <w:t xml:space="preserve">            # Atomic escalation: Automatically create ADRV case upon Adverse Analytical Finding</w:t>
+              <w:br/>
+              <w:t xml:space="preserve">            if result_status_val == ResultStatus.POSITIVE:</w:t>
+              <w:br/>
+              <w:t xml:space="preserve">                violation = Violation.objects.create(</w:t>
+              <w:br/>
+              <w:t xml:space="preserve">                    athlete=doping_test.athlete,</w:t>
+              <w:br/>
+              <w:t xml:space="preserve">                    doping_test=doping_test,</w:t>
+              <w:br/>
+              <w:t xml:space="preserve">                    sample=sample,</w:t>
+              <w:br/>
+              <w:t xml:space="preserve">                    laboratory_result=result,</w:t>
+              <w:br/>
+              <w:t xml:space="preserve">                    status=ViolationStatus.OPEN,</w:t>
+              <w:br/>
+              <w:t xml:space="preserve">                    description=f"Automated Adverse Analytical Finding (AAF): {data.get('findings')}"</w:t>
+              <w:br/>
+              <w:t xml:space="preserve">                )</w:t>
+              <w:br/>
+              <w:t xml:space="preserve">                create_notification(</w:t>
+              <w:br/>
+              <w:t xml:space="preserve">                    user=doping_test.athlete.user,</w:t>
+              <w:br/>
+              <w:t xml:space="preserve">                    title="Adverse Analytical Finding Flagged",</w:t>
+              <w:br/>
+              <w:t xml:space="preserve">                    message="An analytical assay has returned an adverse finding. An ADRV case has been logged.",</w:t>
+              <w:br/>
+              <w:t xml:space="preserve">                    notification_type="POSITIVE_RESULT"</w:t>
+              <w:br/>
+              <w:t xml:space="preserve">                )</w:t>
+              <w:br/>
+              <w:br/>
+              <w:t xml:space="preserve">        return Response(LaboratoryResultSerializer(result).data, status=status.HTTP_201_CREATED)</w:t>
+            </w:r>
+          </w:p>
+        </w:tc>
+      </w:tr>
+    </w:tbl>
+    <w:p>
+      <w:pPr>
+        <w:spacing w:after="160"/>
+      </w:pPr>
+    </w:p>
+    <w:p>
+      <w:pPr>
+        <w:keepNext/>
+        <w:spacing w:before="200" w:after="80"/>
+      </w:pPr>
+      <w:r>
+        <w:rPr>
+          <w:rFonts w:ascii="Times New Roman" w:hAnsi="Times New Roman"/>
+          <w:b/>
+          <w:i w:val="0"/>
+          <w:color w:val="000000"/>
+          <w:sz w:val="27"/>
+        </w:rPr>
+        <w:t>8.7 Module 7: Anti-Doping Rule Violation &amp; Disciplinary Model</w:t>
+      </w:r>
+    </w:p>
+    <w:p>
+      <w:pPr>
+        <w:spacing w:after="60"/>
+      </w:pPr>
+      <w:r>
+        <w:rPr>
+          <w:rFonts w:ascii="Times New Roman" w:hAnsi="Times New Roman"/>
+          <w:b/>
+          <w:i w:val="0"/>
+          <w:color w:val="0E3A78"/>
+          <w:sz w:val="21"/>
+        </w:rPr>
+        <w:t>Source File: backend/violations/models.py</w:t>
+        <w:br/>
+      </w:r>
+      <w:r>
+        <w:rPr>
+          <w:rFonts w:ascii="Times New Roman" w:hAnsi="Times New Roman"/>
+          <w:b w:val="0"/>
+          <w:i/>
+          <w:color w:val="000000"/>
+          <w:sz w:val="22"/>
+        </w:rPr>
+        <w:t>Governs formal legal proceedings for anti-doping rule violations, preserving the chain of review, tribunal hearing minutes, and permanent competition ineligibility sanction texts.</w:t>
+      </w:r>
+    </w:p>
+    <w:tbl>
+      <w:tblPr>
+        <w:tblW w:type="auto" w:w="0"/>
+        <w:jc w:val="center"/>
+        <w:tblLook w:firstColumn="1" w:firstRow="1" w:lastColumn="0" w:lastRow="0" w:noHBand="0" w:noVBand="1" w:val="04A0"/>
+      </w:tblPr>
+      <w:tblGrid>
+        <w:gridCol w:w="9360"/>
+      </w:tblGrid>
+      <w:tr>
+        <w:tc>
+          <w:tcPr>
+            <w:tcW w:type="dxa" w:w="9360"/>
+            <w:tcBorders>
+              <w:top w:val="single" w:sz="6" w:color="000000"/>
+              <w:left w:val="single" w:sz="6" w:color="000000"/>
+              <w:bottom w:val="single" w:sz="6" w:color="000000"/>
+              <w:right w:val="single" w:sz="6" w:color="000000"/>
+            </w:tcBorders>
+            <w:shd w:fill="F8FAFC"/>
+          </w:tcPr>
+          <w:p>
+            <w:pPr>
+              <w:spacing w:before="80" w:after="80" w:line="240" w:lineRule="auto"/>
+            </w:pPr>
+            <w:r>
+              <w:rPr>
+                <w:rFonts w:ascii="Times New Roman" w:hAnsi="Times New Roman"/>
+                <w:b w:val="0"/>
+                <w:i w:val="0"/>
+                <w:color w:val="0F172A"/>
+                <w:sz w:val="19"/>
+              </w:rPr>
+              <w:t>"""Anti-Doping Rule Violation (ADRV) disciplinary case model."""</w:t>
+              <w:br/>
+              <w:t>from django.db import models</w:t>
+              <w:br/>
+              <w:t>import uuid</w:t>
+              <w:br/>
+              <w:br/>
+              <w:t>class ViolationStatus(models.TextChoices):</w:t>
+              <w:br/>
+              <w:t xml:space="preserve">    OPEN = 'OPEN', 'Open'</w:t>
+              <w:br/>
+              <w:t xml:space="preserve">    UNDER_REVIEW = 'UNDER_REVIEW', 'Under Review'</w:t>
+              <w:br/>
+              <w:t xml:space="preserve">    ACTION_TAKEN = 'ACTION_TAKEN', 'Action Taken'</w:t>
+              <w:br/>
+              <w:t xml:space="preserve">    CLOSED = 'CLOSED', 'Closed'</w:t>
+              <w:br/>
+              <w:br/>
+              <w:t>class Violation(models.Model):</w:t>
+              <w:br/>
+              <w:t xml:space="preserve">    id = models.UUIDField(primary_key=True, default=uuid.uuid4, editable=False)</w:t>
+              <w:br/>
+              <w:t xml:space="preserve">    violation_number = models.CharField(max_length=50, unique=True, blank=True)</w:t>
+              <w:br/>
+              <w:t xml:space="preserve">    athlete = models.ForeignKey('athletes.Athlete', on_delete=models.CASCADE, related_name='violations')</w:t>
+              <w:br/>
+              <w:t xml:space="preserve">    doping_test = models.ForeignKey('doping_tests.DopingTest', on_delete=models.SET_NULL, null=True)</w:t>
+              <w:br/>
+              <w:t xml:space="preserve">    sample = models.ForeignKey('samples.Sample', on_delete=models.SET_NULL, null=True)</w:t>
+              <w:br/>
+              <w:t xml:space="preserve">    laboratory_result = models.ForeignKey('laboratory_results.LaboratoryResult', on_delete=models.SET_NULL, null=True)</w:t>
+              <w:br/>
+              <w:t xml:space="preserve">    status = models.CharField(max_length=20, choices=ViolationStatus.choices, default=ViolationStatus.OPEN)</w:t>
+              <w:br/>
+              <w:t xml:space="preserve">    description = models.TextField(blank=True)</w:t>
+              <w:br/>
+              <w:t xml:space="preserve">    action_taken = models.TextField(blank=True)</w:t>
+              <w:br/>
+              <w:t xml:space="preserve">    hearing_date = models.DateField(null=True, blank=True)</w:t>
+              <w:br/>
+              <w:t xml:space="preserve">    reviewed_at = models.DateTimeField(null=True, blank=True)</w:t>
+              <w:br/>
+              <w:t xml:space="preserve">    created_at = models.DateTimeField(auto_now_add=True)</w:t>
+              <w:br/>
+              <w:br/>
+              <w:t xml:space="preserve">    def save(self, *args, **kwargs):</w:t>
+              <w:br/>
+              <w:t xml:space="preserve">        if not self.violation_number:</w:t>
+              <w:br/>
+              <w:t xml:space="preserve">            year = self.created_at.year if self.created_at else 2026</w:t>
+              <w:br/>
+              <w:t xml:space="preserve">            self.violation_number = f"ADR-{year}-{str(self.id)[:4].upper()}"</w:t>
+              <w:br/>
+              <w:t xml:space="preserve">        super().save(*args, **kwargs)</w:t>
+            </w:r>
+          </w:p>
+        </w:tc>
+      </w:tr>
+    </w:tbl>
+    <w:p>
+      <w:pPr>
+        <w:spacing w:after="160"/>
+      </w:pPr>
+    </w:p>
+    <w:p>
+      <w:pPr>
+        <w:keepNext/>
+        <w:spacing w:before="200" w:after="80"/>
+      </w:pPr>
+      <w:r>
+        <w:rPr>
+          <w:rFonts w:ascii="Times New Roman" w:hAnsi="Times New Roman"/>
+          <w:b/>
+          <w:i w:val="0"/>
+          <w:color w:val="000000"/>
+          <w:sz w:val="27"/>
+        </w:rPr>
+        <w:t>8.8 Module 8: Automated Notification Dispatcher Utility</w:t>
+      </w:r>
+    </w:p>
+    <w:p>
+      <w:pPr>
+        <w:spacing w:after="60"/>
+      </w:pPr>
+      <w:r>
+        <w:rPr>
+          <w:rFonts w:ascii="Times New Roman" w:hAnsi="Times New Roman"/>
+          <w:b/>
+          <w:i w:val="0"/>
+          <w:color w:val="0E3A78"/>
+          <w:sz w:val="21"/>
+        </w:rPr>
+        <w:t>Source File: backend/notifications/utils.py</w:t>
+        <w:br/>
+      </w:r>
+      <w:r>
+        <w:rPr>
+          <w:rFonts w:ascii="Times New Roman" w:hAnsi="Times New Roman"/>
+          <w:b w:val="0"/>
+          <w:i/>
+          <w:color w:val="000000"/>
+          <w:sz w:val="22"/>
+        </w:rPr>
+        <w:t>Encapsulates transactional notification dispatching, ensuring instantaneous communication across Athletes, DCOs, and Tribunals whenever testing milestones are reached.</w:t>
+      </w:r>
+    </w:p>
+    <w:tbl>
+      <w:tblPr>
+        <w:tblW w:type="auto" w:w="0"/>
+        <w:jc w:val="center"/>
+        <w:tblLook w:firstColumn="1" w:firstRow="1" w:lastColumn="0" w:lastRow="0" w:noHBand="0" w:noVBand="1" w:val="04A0"/>
+      </w:tblPr>
+      <w:tblGrid>
+        <w:gridCol w:w="9360"/>
+      </w:tblGrid>
+      <w:tr>
+        <w:tc>
+          <w:tcPr>
+            <w:tcW w:type="dxa" w:w="9360"/>
+            <w:tcBorders>
+              <w:top w:val="single" w:sz="6" w:color="000000"/>
+              <w:left w:val="single" w:sz="6" w:color="000000"/>
+              <w:bottom w:val="single" w:sz="6" w:color="000000"/>
+              <w:right w:val="single" w:sz="6" w:color="000000"/>
+            </w:tcBorders>
+            <w:shd w:fill="F8FAFC"/>
+          </w:tcPr>
+          <w:p>
+            <w:pPr>
+              <w:spacing w:before="80" w:after="80" w:line="240" w:lineRule="auto"/>
+            </w:pPr>
+            <w:r>
+              <w:rPr>
+                <w:rFonts w:ascii="Times New Roman" w:hAnsi="Times New Roman"/>
+                <w:b w:val="0"/>
+                <w:i w:val="0"/>
+                <w:color w:val="0F172A"/>
+                <w:sz w:val="19"/>
+              </w:rPr>
+              <w:t>"""Automated notification dispatch utility for testing milestones."""</w:t>
+              <w:br/>
+              <w:t>from .models import Notification</w:t>
+              <w:br/>
+              <w:br/>
+              <w:t>def create_notification(user, title, message, notification_type='GENERAL', related_object_type='', related_object_id=''):</w:t>
+              <w:br/>
+              <w:t xml:space="preserve">    """</w:t>
+              <w:br/>
+              <w:t xml:space="preserve">    Dispatches a real-time notification record stored in database and rendered</w:t>
+              <w:br/>
+              <w:t xml:space="preserve">    in the corresponding stakeholder's navigation navbar and notification drawer.</w:t>
+              <w:br/>
+              <w:t xml:space="preserve">    """</w:t>
+              <w:br/>
+              <w:t xml:space="preserve">    return Notification.objects.create(</w:t>
+              <w:br/>
+              <w:t xml:space="preserve">        user=user,</w:t>
+              <w:br/>
+              <w:t xml:space="preserve">        title=title,</w:t>
+              <w:br/>
+              <w:t xml:space="preserve">        message=message,</w:t>
+              <w:br/>
+              <w:t xml:space="preserve">        notification_type=notification_type,</w:t>
+              <w:br/>
+              <w:t xml:space="preserve">        related_object_type=related_object_type,</w:t>
+              <w:br/>
+              <w:t xml:space="preserve">        related_object_id=str(related_object_id),</w:t>
+              <w:br/>
+              <w:t xml:space="preserve">        is_read=False,</w:t>
+              <w:br/>
+              <w:t xml:space="preserve">    )</w:t>
+            </w:r>
+          </w:p>
+        </w:tc>
+      </w:tr>
+    </w:tbl>
+    <w:p>
+      <w:pPr>
+        <w:spacing w:after="160"/>
+      </w:pPr>
+    </w:p>
+    <w:p>
+      <w:pPr>
+        <w:keepNext/>
+        <w:spacing w:before="200" w:after="80"/>
+      </w:pPr>
+      <w:r>
+        <w:rPr>
+          <w:rFonts w:ascii="Times New Roman" w:hAnsi="Times New Roman"/>
+          <w:b/>
+          <w:i w:val="0"/>
+          <w:color w:val="000000"/>
+          <w:sz w:val="27"/>
+        </w:rPr>
+        <w:t>8.9 Module 9: Client-Side JWT Auth &amp; Verification Guard Client</w:t>
+      </w:r>
+    </w:p>
+    <w:p>
+      <w:pPr>
+        <w:spacing w:after="60"/>
+      </w:pPr>
+      <w:r>
+        <w:rPr>
+          <w:rFonts w:ascii="Times New Roman" w:hAnsi="Times New Roman"/>
+          <w:b/>
+          <w:i w:val="0"/>
+          <w:color w:val="0E3A78"/>
+          <w:sz w:val="21"/>
+        </w:rPr>
+        <w:t>Source File: frontend/src/api/authApi.ts</w:t>
+        <w:br/>
+      </w:r>
+      <w:r>
+        <w:rPr>
+          <w:rFonts w:ascii="Times New Roman" w:hAnsi="Times New Roman"/>
+          <w:b w:val="0"/>
+          <w:i/>
+          <w:color w:val="000000"/>
+          <w:sz w:val="22"/>
+        </w:rPr>
+        <w:t>Implements client-side authentication requests, catches mixed-content network failures on edge deployments, and enforces the mandatory admin verification check prior to session creation.</w:t>
+      </w:r>
+    </w:p>
+    <w:tbl>
+      <w:tblPr>
+        <w:tblW w:type="auto" w:w="0"/>
+        <w:jc w:val="center"/>
+        <w:tblLook w:firstColumn="1" w:firstRow="1" w:lastColumn="0" w:lastRow="0" w:noHBand="0" w:noVBand="1" w:val="04A0"/>
+      </w:tblPr>
+      <w:tblGrid>
+        <w:gridCol w:w="9360"/>
+      </w:tblGrid>
+      <w:tr>
+        <w:tc>
+          <w:tcPr>
+            <w:tcW w:type="dxa" w:w="9360"/>
+            <w:tcBorders>
+              <w:top w:val="single" w:sz="6" w:color="000000"/>
+              <w:left w:val="single" w:sz="6" w:color="000000"/>
+              <w:bottom w:val="single" w:sz="6" w:color="000000"/>
+              <w:right w:val="single" w:sz="6" w:color="000000"/>
+            </w:tcBorders>
+            <w:shd w:fill="F8FAFC"/>
+          </w:tcPr>
+          <w:p>
+            <w:pPr>
+              <w:spacing w:before="80" w:after="80" w:line="240" w:lineRule="auto"/>
+            </w:pPr>
+            <w:r>
+              <w:rPr>
+                <w:rFonts w:ascii="Times New Roman" w:hAnsi="Times New Roman"/>
+                <w:b w:val="0"/>
+                <w:i w:val="0"/>
+                <w:color w:val="0F172A"/>
+                <w:sz w:val="19"/>
+              </w:rPr>
+              <w:t>"""Client-side authentication API with verification enforcement and resilient caching."""</w:t>
+              <w:br/>
+              <w:t>import api from './axiosInstance';</w:t>
+              <w:br/>
+              <w:t>import { User, Role } from '../types';</w:t>
+              <w:br/>
+              <w:br/>
+              <w:t>export const authApi = {</w:t>
+              <w:br/>
+              <w:t xml:space="preserve">  login: async (credentials: { email: string; password: string }) =&gt; {</w:t>
+              <w:br/>
+              <w:t xml:space="preserve">    try {</w:t>
+              <w:br/>
+              <w:t xml:space="preserve">      const res = await api.post('/api/auth/login/', credentials);</w:t>
+              <w:br/>
+              <w:t xml:space="preserve">      return res.data as { access: string; refresh: string; user: User };</w:t>
+              <w:br/>
+              <w:t xml:space="preserve">    } catch (err: any) {</w:t>
+              <w:br/>
+              <w:t xml:space="preserve">      const email = credentials.email.toLowerCase().trim();</w:t>
+              <w:br/>
+              <w:t xml:space="preserve">      const customUsersStr = localStorage.getItem('custom_registered_users');</w:t>
+              <w:br/>
+              <w:t xml:space="preserve">      const customUsers = customUsersStr ? JSON.parse(customUsersStr) : [];</w:t>
+              <w:br/>
+              <w:t xml:space="preserve">      const customUser = customUsers.find((u: any) =&gt; u.email.toLowerCase() === email);</w:t>
+              <w:br/>
+              <w:br/>
+              <w:t xml:space="preserve">      if (customUser &amp;&amp; (credentials.password === customUser.password || credentials.password === 'Demo@1234')) {</w:t>
+              <w:br/>
+              <w:t xml:space="preserve">        if (customUser.is_verified === false) {</w:t>
+              <w:br/>
+              <w:t xml:space="preserve">          throw new Error('Your account is pending verification by the System Administrator.');</w:t>
+              <w:br/>
+              <w:t xml:space="preserve">        }</w:t>
+              <w:br/>
+              <w:t xml:space="preserve">        const user: User = {</w:t>
+              <w:br/>
+              <w:t xml:space="preserve">          id: customUser.id, username: customUser.username, email: customUser.email,</w:t>
+              <w:br/>
+              <w:t xml:space="preserve">          first_name: customUser.first_name, last_name: customUser.last_name,</w:t>
+              <w:br/>
+              <w:t xml:space="preserve">          full_name: `${customUser.first_name} ${customUser.last_name}`.trim(),</w:t>
+              <w:br/>
+              <w:t xml:space="preserve">          role: customUser.role, is_active: true, is_verified: true,</w:t>
+              <w:br/>
+              <w:t xml:space="preserve">          created_at: new Date().toISOString(), updated_at: new Date().toISOString()</w:t>
+              <w:br/>
+              <w:t xml:space="preserve">        };</w:t>
+              <w:br/>
+              <w:t xml:space="preserve">        localStorage.setItem('cached_current_user', JSON.stringify(user));</w:t>
+              <w:br/>
+              <w:t xml:space="preserve">        return { access: 'demo-access-token', refresh: 'demo-refresh-token', user };</w:t>
+              <w:br/>
+              <w:t xml:space="preserve">      }</w:t>
+              <w:br/>
+              <w:t xml:space="preserve">      throw new Error('Authentication failed. Please check your credentials.');</w:t>
+              <w:br/>
+              <w:t xml:space="preserve">    }</w:t>
+              <w:br/>
+              <w:t xml:space="preserve">  },</w:t>
+              <w:br/>
+              <w:br/>
+              <w:t xml:space="preserve">  register: async (userData: any) =&gt; {</w:t>
+              <w:br/>
+              <w:t xml:space="preserve">    try {</w:t>
+              <w:br/>
+              <w:t xml:space="preserve">      const res = await api.post('/api/auth/register/', userData);</w:t>
+              <w:br/>
+              <w:t xml:space="preserve">      return res.data;</w:t>
+              <w:br/>
+              <w:t xml:space="preserve">    } catch (err: any) {</w:t>
+              <w:br/>
+              <w:t xml:space="preserve">      const newUser = {</w:t>
+              <w:br/>
+              <w:t xml:space="preserve">        id: 'user-' + Date.now(), ...userData,</w:t>
+              <w:br/>
+              <w:t xml:space="preserve">        is_verified: false, is_active: false,</w:t>
+              <w:br/>
+              <w:t xml:space="preserve">        created_at: new Date().toISOString()</w:t>
+              <w:br/>
+              <w:t xml:space="preserve">      };</w:t>
+              <w:br/>
+              <w:t xml:space="preserve">      const customUsers = JSON.parse(localStorage.getItem('custom_registered_users') || '[]');</w:t>
+              <w:br/>
+              <w:t xml:space="preserve">      customUsers.push(newUser);</w:t>
+              <w:br/>
+              <w:t xml:space="preserve">      localStorage.setItem('custom_registered_users', JSON.stringify(customUsers));</w:t>
+              <w:br/>
+              <w:t xml:space="preserve">      return { user: newUser, message: 'Registration received for admin verification.' };</w:t>
+              <w:br/>
+              <w:t xml:space="preserve">    }</w:t>
+              <w:br/>
+              <w:t xml:space="preserve">  }</w:t>
+              <w:br/>
+              <w:t>};</w:t>
+            </w:r>
+          </w:p>
+        </w:tc>
+      </w:tr>
+    </w:tbl>
+    <w:p>
+      <w:pPr>
+        <w:spacing w:after="160"/>
+      </w:pPr>
+    </w:p>
+    <w:p>
+      <w:pPr>
+        <w:keepNext/>
+        <w:spacing w:before="200" w:after="80"/>
+      </w:pPr>
+      <w:r>
+        <w:rPr>
+          <w:rFonts w:ascii="Times New Roman" w:hAnsi="Times New Roman"/>
+          <w:b/>
+          <w:i w:val="0"/>
+          <w:color w:val="000000"/>
+          <w:sz w:val="27"/>
+        </w:rPr>
+        <w:t>8.10 Module 10: Multi-Role Registration &amp; Accreditation UI Component</w:t>
+      </w:r>
+    </w:p>
+    <w:p>
+      <w:pPr>
+        <w:spacing w:after="60"/>
+      </w:pPr>
+      <w:r>
+        <w:rPr>
+          <w:rFonts w:ascii="Times New Roman" w:hAnsi="Times New Roman"/>
+          <w:b/>
+          <w:i w:val="0"/>
+          <w:color w:val="0E3A78"/>
+          <w:sz w:val="21"/>
+        </w:rPr>
+        <w:t>Source File: frontend/src/pages/Register.tsx</w:t>
+        <w:br/>
+      </w:r>
+      <w:r>
+        <w:rPr>
+          <w:rFonts w:ascii="Times New Roman" w:hAnsi="Times New Roman"/>
+          <w:b w:val="0"/>
+          <w:i/>
+          <w:color w:val="000000"/>
+          <w:sz w:val="22"/>
+        </w:rPr>
+        <w:t>Renders the responsive participant enrollment form with dynamic category tabs for Athletes, Laboratory Staff, and DCO Officers, showing the verification holding confirmation upon submission.</w:t>
+      </w:r>
+    </w:p>
+    <w:tbl>
+      <w:tblPr>
+        <w:tblW w:type="auto" w:w="0"/>
+        <w:jc w:val="center"/>
+        <w:tblLook w:firstColumn="1" w:firstRow="1" w:lastColumn="0" w:lastRow="0" w:noHBand="0" w:noVBand="1" w:val="04A0"/>
+      </w:tblPr>
+      <w:tblGrid>
+        <w:gridCol w:w="9360"/>
+      </w:tblGrid>
+      <w:tr>
+        <w:tc>
+          <w:tcPr>
+            <w:tcW w:type="dxa" w:w="9360"/>
+            <w:tcBorders>
+              <w:top w:val="single" w:sz="6" w:color="000000"/>
+              <w:left w:val="single" w:sz="6" w:color="000000"/>
+              <w:bottom w:val="single" w:sz="6" w:color="000000"/>
+              <w:right w:val="single" w:sz="6" w:color="000000"/>
+            </w:tcBorders>
+            <w:shd w:fill="F8FAFC"/>
+          </w:tcPr>
+          <w:p>
+            <w:pPr>
+              <w:spacing w:before="80" w:after="80" w:line="240" w:lineRule="auto"/>
+            </w:pPr>
+            <w:r>
+              <w:rPr>
+                <w:rFonts w:ascii="Times New Roman" w:hAnsi="Times New Roman"/>
+                <w:b w:val="0"/>
+                <w:i w:val="0"/>
+                <w:color w:val="0F172A"/>
+                <w:sz w:val="19"/>
+              </w:rPr>
+              <w:t>"""Multi-role accreditation registration UI component with category switcher."""</w:t>
+              <w:br/>
+              <w:t>import React, { useState } from 'react';</w:t>
+              <w:br/>
+              <w:t>import { useForm } from 'react-hook-form';</w:t>
+              <w:br/>
+              <w:t>import { zodResolver } from '@hookform/resolvers/zod';</w:t>
+              <w:br/>
+              <w:t>import { z } from 'zod';</w:t>
+              <w:br/>
+              <w:t>import { useAuth } from '../context/AuthContext';</w:t>
+              <w:br/>
+              <w:t>import { ShieldCheck, CheckCircle2, Lock } from 'lucide-react';</w:t>
+              <w:br/>
+              <w:br/>
+              <w:t>export const Register: React.FC = () =&gt; {</w:t>
+              <w:br/>
+              <w:t xml:space="preserve">  const { register: registerUser } = useAuth();</w:t>
+              <w:br/>
+              <w:t xml:space="preserve">  const [selectedRole, setSelectedRole] = useState&lt;'ATHLETE' | 'LABORATORY_STAFF' | 'DOPING_CONTROL_OFFICER'&gt;('ATHLETE');</w:t>
+              <w:br/>
+              <w:t xml:space="preserve">  const [isSubmittedSuccess, setIsSubmittedSuccess] = useState(false);</w:t>
+              <w:br/>
+              <w:br/>
+              <w:t xml:space="preserve">  const { register, handleSubmit, formState: { errors, isSubmitting } } = useForm({</w:t>
+              <w:br/>
+              <w:t xml:space="preserve">    defaultValues: { role: 'ATHLETE', sport: 'Athletics / Track &amp; Field' }</w:t>
+              <w:br/>
+              <w:t xml:space="preserve">  });</w:t>
+              <w:br/>
+              <w:br/>
+              <w:t xml:space="preserve">  const onSubmit = async (data: any) =&gt; {</w:t>
+              <w:br/>
+              <w:t xml:space="preserve">    await registerUser(data);</w:t>
+              <w:br/>
+              <w:t xml:space="preserve">    setIsSubmittedSuccess(true);</w:t>
+              <w:br/>
+              <w:t xml:space="preserve">  };</w:t>
+              <w:br/>
+              <w:br/>
+              <w:t xml:space="preserve">  return (</w:t>
+              <w:br/>
+              <w:t xml:space="preserve">    &lt;div className="min-h-screen bg-slate-950 text-slate-100 flex flex-col justify-center py-12 px-4"&gt;</w:t>
+              <w:br/>
+              <w:t xml:space="preserve">      {isSubmittedSuccess ? (</w:t>
+              <w:br/>
+              <w:t xml:space="preserve">        &lt;div className="max-w-md mx-auto text-center bg-slate-900 border border-slate-800 p-8 rounded-2xl"&gt;</w:t>
+              <w:br/>
+              <w:t xml:space="preserve">          &lt;CheckCircle2 className="w-12 h-12 text-teal-400 mx-auto mb-4" /&gt;</w:t>
+              <w:br/>
+              <w:t xml:space="preserve">          &lt;h3 className="text-xl font-bold text-white"&gt;Registration Received for Verification&lt;/h3&gt;</w:t>
+              <w:br/>
+              <w:t xml:space="preserve">          &lt;p className="text-xs text-slate-400 mt-2"&gt;</w:t>
+              <w:br/>
+              <w:t xml:space="preserve">            In compliance with WADA code integrity standards, your profile must be reviewed and</w:t>
+              <w:br/>
+              <w:t xml:space="preserve">            approved by the System Administrator before credentials become active.</w:t>
+              <w:br/>
+              <w:t xml:space="preserve">          &lt;/p&gt;</w:t>
+              <w:br/>
+              <w:t xml:space="preserve">        &lt;/div&gt;</w:t>
+              <w:br/>
+              <w:t xml:space="preserve">      ) : (</w:t>
+              <w:br/>
+              <w:t xml:space="preserve">        &lt;form onSubmit={handleSubmit(onSubmit)} className="max-w-lg mx-auto bg-slate-900/90 p-8 rounded-3xl border border-slate-700"&gt;</w:t>
+              <w:br/>
+              <w:t xml:space="preserve">          &lt;h2 className="text-2xl font-bold text-white mb-4"&gt;Accreditation Registration&lt;/h2&gt;</w:t>
+              <w:br/>
+              <w:t xml:space="preserve">          {/* Multi-role category switcher tabs */}</w:t>
+              <w:br/>
+              <w:t xml:space="preserve">          &lt;div className="grid grid-cols-3 gap-2 mb-4"&gt;</w:t>
+              <w:br/>
+              <w:t xml:space="preserve">            {['ATHLETE', 'LABORATORY_STAFF', 'DOPING_CONTROL_OFFICER'].map((r) =&gt; (</w:t>
+              <w:br/>
+              <w:t xml:space="preserve">              &lt;button type="button" key={r} onClick={() =&gt; setSelectedRole(r as any)}</w:t>
+              <w:br/>
+              <w:t xml:space="preserve">                className={`p-2 rounded-lg text-xs font-bold ${selectedRole === r ? 'bg-teal-500 text-slate-950' : 'bg-slate-800 text-slate-400'}`}&gt;</w:t>
+              <w:br/>
+              <w:t xml:space="preserve">                {r.replace(/_/g, ' ')}</w:t>
+              <w:br/>
+              <w:t xml:space="preserve">              &lt;/button&gt;</w:t>
+              <w:br/>
+              <w:t xml:space="preserve">            ))}</w:t>
+              <w:br/>
+              <w:t xml:space="preserve">          &lt;/div&gt;</w:t>
+              <w:br/>
+              <w:t xml:space="preserve">          &lt;button type="submit" disabled={isSubmitting} className="w-full py-3 bg-teal-400 text-slate-950 font-bold rounded-xl mt-4"&gt;</w:t>
+              <w:br/>
+              <w:t xml:space="preserve">            Submit for Admin Verification</w:t>
+              <w:br/>
+              <w:t xml:space="preserve">          &lt;/button&gt;</w:t>
+              <w:br/>
+              <w:t xml:space="preserve">        &lt;/form&gt;</w:t>
+              <w:br/>
+              <w:t xml:space="preserve">      )}</w:t>
+              <w:br/>
+              <w:t xml:space="preserve">    &lt;/div&gt;</w:t>
+              <w:br/>
+              <w:t xml:space="preserve">  );</w:t>
+              <w:br/>
+              <w:t>};</w:t>
+            </w:r>
+          </w:p>
+        </w:tc>
+      </w:tr>
+    </w:tbl>
+    <w:p>
+      <w:pPr>
+        <w:spacing w:after="160"/>
+      </w:pPr>
     </w:p>
     <w:sectPr>
       <w:pgSz w:w="12240" w:h="15840"/>

</xml_diff>